<commit_message>
Complete Week 3: generic tests, custom test, dedupe stg_orders, store_failures
</commit_message>
<xml_diff>
--- a/week_2/Week1_Recap_Week2_Guide.docx
+++ b/week_2/Week1_Recap_Week2_Guide.docx
@@ -88,19 +88,6 @@
           <w:sz w:val="24"/>
         </w:rPr>
         <w:t xml:space="preserve"> why each step matters, because that understanding is what carries over into every future project you touch, long after these specific tables are forgotten.</w:t>
-      </w:r>
-    </w:p>
-    <w:p>
-      <w:pPr>
-        <w:spacing w:after="160"/>
-      </w:pPr>
-      <w:r>
-        <w:rPr>
-          <w:i/>
-          <w:color w:val="555555"/>
-          <w:sz w:val="24"/>
-        </w:rPr>
-        <w:t>Read it top to bottom before opening the code. It will take longer than skimming straight to the task list, but it will save you far more time than it costs once you hit something unexpected.</w:t>
       </w:r>
     </w:p>
     <w:p>

</xml_diff>